<commit_message>
Fixed Logistic Regression convergence warning
</commit_message>
<xml_diff>
--- a/reports/Credit_Risk_Project_Report.docx
+++ b/reports/Credit_Risk_Project_Report.docx
@@ -1107,248 +1107,125 @@
           <w:rFonts w:ascii="Times New Roman" w:hAnsi="Times New Roman" w:cs="Times New Roman"/>
         </w:rPr>
       </w:pPr>
-    </w:p>
-    <w:tbl>
-      <w:tblPr>
-        <w:tblStyle w:val="TableGrid"/>
-        <w:tblW w:w="0" w:type="auto"/>
-        <w:tblInd w:w="846" w:type="dxa"/>
-        <w:tblLook w:val="04A0" w:firstRow="1" w:lastRow="0" w:firstColumn="1" w:lastColumn="0" w:noHBand="0" w:noVBand="1"/>
-      </w:tblPr>
-      <w:tblGrid>
-        <w:gridCol w:w="3662"/>
-        <w:gridCol w:w="3000"/>
-      </w:tblGrid>
-      <w:tr>
-        <w:tc>
-          <w:tcPr>
-            <w:tcW w:w="3662" w:type="dxa"/>
-            <w:shd w:val="clear" w:color="auto" w:fill="E8E8E8" w:themeFill="background2"/>
-          </w:tcPr>
-          <w:p>
-            <w:pPr>
-              <w:spacing w:line="360" w:lineRule="auto"/>
-              <w:jc w:val="center"/>
-              <w:rPr>
-                <w:rFonts w:ascii="Times New Roman" w:hAnsi="Times New Roman" w:cs="Times New Roman"/>
-              </w:rPr>
-            </w:pPr>
-            <w:r>
-              <w:rPr>
-                <w:rFonts w:ascii="Times New Roman" w:hAnsi="Times New Roman" w:cs="Times New Roman"/>
-                <w:b/>
-                <w:bCs/>
-              </w:rPr>
-              <w:t>Model</w:t>
-            </w:r>
-          </w:p>
-        </w:tc>
-        <w:tc>
-          <w:tcPr>
-            <w:tcW w:w="3000" w:type="dxa"/>
-            <w:shd w:val="clear" w:color="auto" w:fill="E8E8E8" w:themeFill="background2"/>
-          </w:tcPr>
-          <w:p>
-            <w:pPr>
-              <w:spacing w:line="360" w:lineRule="auto"/>
-              <w:jc w:val="center"/>
-              <w:rPr>
-                <w:rFonts w:ascii="Times New Roman" w:hAnsi="Times New Roman" w:cs="Times New Roman"/>
-              </w:rPr>
-            </w:pPr>
-            <w:r>
-              <w:rPr>
-                <w:rFonts w:ascii="Times New Roman" w:hAnsi="Times New Roman" w:cs="Times New Roman"/>
-                <w:b/>
-                <w:bCs/>
-              </w:rPr>
-              <w:t>Accuracy</w:t>
-            </w:r>
-          </w:p>
-        </w:tc>
-      </w:tr>
-      <w:tr>
-        <w:tc>
-          <w:tcPr>
-            <w:tcW w:w="3662" w:type="dxa"/>
-          </w:tcPr>
-          <w:p>
-            <w:pPr>
-              <w:spacing w:line="360" w:lineRule="auto"/>
-              <w:jc w:val="center"/>
-              <w:rPr>
-                <w:rFonts w:ascii="Times New Roman" w:hAnsi="Times New Roman" w:cs="Times New Roman"/>
-              </w:rPr>
-            </w:pPr>
-            <w:r>
-              <w:rPr>
-                <w:rFonts w:ascii="Times New Roman" w:hAnsi="Times New Roman" w:cs="Times New Roman"/>
-              </w:rPr>
-              <w:t>Logistic Regression</w:t>
-            </w:r>
-          </w:p>
-        </w:tc>
-        <w:tc>
-          <w:tcPr>
-            <w:tcW w:w="3000" w:type="dxa"/>
-          </w:tcPr>
-          <w:p>
-            <w:pPr>
-              <w:spacing w:line="360" w:lineRule="auto"/>
-              <w:jc w:val="center"/>
-              <w:rPr>
-                <w:rFonts w:ascii="Times New Roman" w:hAnsi="Times New Roman" w:cs="Times New Roman"/>
-              </w:rPr>
-            </w:pPr>
-            <w:r>
-              <w:rPr>
-                <w:rFonts w:ascii="Times New Roman" w:hAnsi="Times New Roman" w:cs="Times New Roman"/>
-              </w:rPr>
-              <w:t>75.8%</w:t>
-            </w:r>
-          </w:p>
-        </w:tc>
-      </w:tr>
-      <w:tr>
-        <w:tc>
-          <w:tcPr>
-            <w:tcW w:w="3662" w:type="dxa"/>
-          </w:tcPr>
-          <w:p>
-            <w:pPr>
-              <w:spacing w:line="360" w:lineRule="auto"/>
-              <w:jc w:val="center"/>
-              <w:rPr>
-                <w:rFonts w:ascii="Times New Roman" w:hAnsi="Times New Roman" w:cs="Times New Roman"/>
-              </w:rPr>
-            </w:pPr>
-            <w:r>
-              <w:rPr>
-                <w:rFonts w:ascii="Times New Roman" w:hAnsi="Times New Roman" w:cs="Times New Roman"/>
-              </w:rPr>
-              <w:t>Random Forest</w:t>
-            </w:r>
-          </w:p>
-        </w:tc>
-        <w:tc>
-          <w:tcPr>
-            <w:tcW w:w="3000" w:type="dxa"/>
-          </w:tcPr>
-          <w:p>
-            <w:pPr>
-              <w:spacing w:line="360" w:lineRule="auto"/>
-              <w:jc w:val="center"/>
-              <w:rPr>
-                <w:rFonts w:ascii="Times New Roman" w:hAnsi="Times New Roman" w:cs="Times New Roman"/>
-              </w:rPr>
-            </w:pPr>
-            <w:r>
-              <w:rPr>
-                <w:rFonts w:ascii="Times New Roman" w:hAnsi="Times New Roman" w:cs="Times New Roman"/>
-              </w:rPr>
-              <w:t>91.1%</w:t>
-            </w:r>
-          </w:p>
-        </w:tc>
-      </w:tr>
-      <w:tr>
-        <w:tc>
-          <w:tcPr>
-            <w:tcW w:w="3662" w:type="dxa"/>
-          </w:tcPr>
-          <w:p>
-            <w:pPr>
-              <w:spacing w:line="360" w:lineRule="auto"/>
-              <w:jc w:val="center"/>
-              <w:rPr>
-                <w:rFonts w:ascii="Times New Roman" w:hAnsi="Times New Roman" w:cs="Times New Roman"/>
-              </w:rPr>
-            </w:pPr>
-            <w:proofErr w:type="spellStart"/>
-            <w:r>
-              <w:rPr>
-                <w:rFonts w:ascii="Times New Roman" w:hAnsi="Times New Roman" w:cs="Times New Roman"/>
-              </w:rPr>
-              <w:t>XGBoost</w:t>
-            </w:r>
-            <w:proofErr w:type="spellEnd"/>
-          </w:p>
-        </w:tc>
-        <w:tc>
-          <w:tcPr>
-            <w:tcW w:w="3000" w:type="dxa"/>
-          </w:tcPr>
-          <w:p>
-            <w:pPr>
-              <w:spacing w:line="360" w:lineRule="auto"/>
-              <w:jc w:val="center"/>
-              <w:rPr>
-                <w:rFonts w:ascii="Times New Roman" w:hAnsi="Times New Roman" w:cs="Times New Roman"/>
-              </w:rPr>
-            </w:pPr>
-            <w:r>
-              <w:rPr>
-                <w:rFonts w:ascii="Times New Roman" w:hAnsi="Times New Roman" w:cs="Times New Roman"/>
-              </w:rPr>
-              <w:t>93.6%</w:t>
-            </w:r>
-          </w:p>
-        </w:tc>
-      </w:tr>
-      <w:tr>
-        <w:tc>
-          <w:tcPr>
-            <w:tcW w:w="3662" w:type="dxa"/>
-          </w:tcPr>
-          <w:p>
-            <w:pPr>
-              <w:spacing w:line="360" w:lineRule="auto"/>
-              <w:jc w:val="center"/>
-              <w:rPr>
-                <w:rFonts w:ascii="Times New Roman" w:hAnsi="Times New Roman" w:cs="Times New Roman"/>
-              </w:rPr>
-            </w:pPr>
-            <w:r>
-              <w:rPr>
-                <w:rFonts w:ascii="Times New Roman" w:hAnsi="Times New Roman" w:cs="Times New Roman"/>
-              </w:rPr>
-              <w:t xml:space="preserve">Tuned </w:t>
-            </w:r>
-            <w:proofErr w:type="spellStart"/>
-            <w:r>
-              <w:rPr>
-                <w:rFonts w:ascii="Times New Roman" w:hAnsi="Times New Roman" w:cs="Times New Roman"/>
-              </w:rPr>
-              <w:t>XGBoost</w:t>
-            </w:r>
-            <w:proofErr w:type="spellEnd"/>
-          </w:p>
-        </w:tc>
-        <w:tc>
-          <w:tcPr>
-            <w:tcW w:w="3000" w:type="dxa"/>
-            <w:tcBorders>
-              <w:bottom w:val="single" w:sz="4" w:space="0" w:color="auto"/>
-            </w:tcBorders>
-          </w:tcPr>
-          <w:p>
-            <w:pPr>
-              <w:spacing w:line="360" w:lineRule="auto"/>
-              <w:jc w:val="center"/>
-              <w:rPr>
-                <w:rFonts w:ascii="Times New Roman" w:hAnsi="Times New Roman" w:cs="Times New Roman"/>
-              </w:rPr>
-            </w:pPr>
-            <w:r>
-              <w:rPr>
-                <w:rFonts w:ascii="Times New Roman" w:hAnsi="Times New Roman" w:cs="Times New Roman"/>
-              </w:rPr>
-              <w:t>94.7%</w:t>
-            </w:r>
-          </w:p>
-        </w:tc>
-      </w:tr>
-    </w:tbl>
+      <w:r>
+        <w:rPr>
+          <w:noProof/>
+        </w:rPr>
+        <mc:AlternateContent>
+          <mc:Choice Requires="wps">
+            <w:drawing>
+              <wp:inline distT="0" distB="0" distL="0" distR="0" wp14:anchorId="07F55A62" wp14:editId="71681C9A">
+                <wp:extent cx="304800" cy="304800"/>
+                <wp:effectExtent l="0" t="0" r="0" b="0"/>
+                <wp:docPr id="1623516136" name="Rectangle 1"/>
+                <wp:cNvGraphicFramePr>
+                  <a:graphicFrameLocks xmlns:a="http://schemas.openxmlformats.org/drawingml/2006/main" noChangeAspect="1"/>
+                </wp:cNvGraphicFramePr>
+                <a:graphic xmlns:a="http://schemas.openxmlformats.org/drawingml/2006/main">
+                  <a:graphicData uri="http://schemas.microsoft.com/office/word/2010/wordprocessingShape">
+                    <wps:wsp>
+                      <wps:cNvSpPr>
+                        <a:spLocks noChangeAspect="1" noChangeArrowheads="1"/>
+                      </wps:cNvSpPr>
+                      <wps:spPr bwMode="auto">
+                        <a:xfrm>
+                          <a:off x="0" y="0"/>
+                          <a:ext cx="304800" cy="304800"/>
+                        </a:xfrm>
+                        <a:prstGeom prst="rect">
+                          <a:avLst/>
+                        </a:prstGeom>
+                        <a:noFill/>
+                        <a:ln>
+                          <a:noFill/>
+                        </a:ln>
+                        <a:extLst>
+                          <a:ext uri="{909E8E84-426E-40DD-AFC4-6F175D3DCCD1}">
+                            <a14:hiddenFill xmlns:a14="http://schemas.microsoft.com/office/drawing/2010/main">
+                              <a:solidFill>
+                                <a:srgbClr val="FFFFFF"/>
+                              </a:solidFill>
+                            </a14:hiddenFill>
+                          </a:ext>
+                          <a:ext uri="{91240B29-F687-4F45-9708-019B960494DF}">
+                            <a14:hiddenLine xmlns:a14="http://schemas.microsoft.com/office/drawing/2010/main" w="9525">
+                              <a:solidFill>
+                                <a:srgbClr val="000000"/>
+                              </a:solidFill>
+                              <a:miter lim="800000"/>
+                              <a:headEnd/>
+                              <a:tailEnd/>
+                            </a14:hiddenLine>
+                          </a:ext>
+                        </a:extLst>
+                      </wps:spPr>
+                      <wps:bodyPr rot="0" vert="horz" wrap="square" lIns="91440" tIns="45720" rIns="91440" bIns="45720" anchor="t" anchorCtr="0" upright="1">
+                        <a:noAutofit/>
+                      </wps:bodyPr>
+                    </wps:wsp>
+                  </a:graphicData>
+                </a:graphic>
+              </wp:inline>
+            </w:drawing>
+          </mc:Choice>
+          <mc:Fallback>
+            <w:pict>
+              <v:rect w14:anchorId="12BFBB41" id="Rectangle 1" o:spid="_x0000_s1026" style="width:24pt;height:24pt;visibility:visible;mso-wrap-style:square;mso-left-percent:-10001;mso-top-percent:-10001;mso-position-horizontal:absolute;mso-position-horizontal-relative:char;mso-position-vertical:absolute;mso-position-vertical-relative:line;mso-left-percent:-10001;mso-top-percent:-10001;v-text-anchor:top" o:gfxdata="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" filled="f" stroked="f">
+                <o:lock v:ext="edit" aspectratio="t"/>
+                <w10:anchorlock/>
+              </v:rect>
+            </w:pict>
+          </mc:Fallback>
+        </mc:AlternateContent>
+      </w:r>
+      <w:r>
+        <w:rPr>
+          <w:rFonts w:ascii="Times New Roman" w:hAnsi="Times New Roman" w:cs="Times New Roman"/>
+          <w:noProof/>
+        </w:rPr>
+        <w:drawing>
+          <wp:inline distT="0" distB="0" distL="0" distR="0" wp14:anchorId="792F71DD" wp14:editId="5ADDE219">
+            <wp:extent cx="5731510" cy="2552700"/>
+            <wp:effectExtent l="0" t="0" r="2540" b="0"/>
+            <wp:docPr id="1811759424" name="Picture 2"/>
+            <wp:cNvGraphicFramePr>
+              <a:graphicFrameLocks xmlns:a="http://schemas.openxmlformats.org/drawingml/2006/main" noChangeAspect="1"/>
+            </wp:cNvGraphicFramePr>
+            <a:graphic xmlns:a="http://schemas.openxmlformats.org/drawingml/2006/main">
+              <a:graphicData uri="http://schemas.openxmlformats.org/drawingml/2006/picture">
+                <pic:pic xmlns:pic="http://schemas.openxmlformats.org/drawingml/2006/picture">
+                  <pic:nvPicPr>
+                    <pic:cNvPr id="1811759424" name="Picture 1811759424"/>
+                    <pic:cNvPicPr/>
+                  </pic:nvPicPr>
+                  <pic:blipFill>
+                    <a:blip r:embed="rId5">
+                      <a:extLst>
+                        <a:ext uri="{28A0092B-C50C-407E-A947-70E740481C1C}">
+                          <a14:useLocalDpi xmlns:a14="http://schemas.microsoft.com/office/drawing/2010/main" val="0"/>
+                        </a:ext>
+                      </a:extLst>
+                    </a:blip>
+                    <a:stretch>
+                      <a:fillRect/>
+                    </a:stretch>
+                  </pic:blipFill>
+                  <pic:spPr>
+                    <a:xfrm>
+                      <a:off x="0" y="0"/>
+                      <a:ext cx="5731510" cy="2552700"/>
+                    </a:xfrm>
+                    <a:prstGeom prst="rect">
+                      <a:avLst/>
+                    </a:prstGeom>
+                  </pic:spPr>
+                </pic:pic>
+              </a:graphicData>
+            </a:graphic>
+          </wp:inline>
+        </w:drawing>
+      </w:r>
+    </w:p>
     <w:p>
       <w:pPr>
         <w:spacing w:line="360" w:lineRule="auto"/>
@@ -1537,7 +1414,7 @@
                     <pic:cNvPicPr/>
                   </pic:nvPicPr>
                   <pic:blipFill>
-                    <a:blip r:embed="rId5" cstate="print">
+                    <a:blip r:embed="rId6" cstate="print">
                       <a:extLst>
                         <a:ext uri="{28A0092B-C50C-407E-A947-70E740481C1C}">
                           <a14:useLocalDpi xmlns:a14="http://schemas.microsoft.com/office/drawing/2010/main" val="0"/>
@@ -1715,7 +1592,7 @@
                     </pic:cNvPicPr>
                   </pic:nvPicPr>
                   <pic:blipFill>
-                    <a:blip r:embed="rId6">
+                    <a:blip r:embed="rId7">
                       <a:extLst>
                         <a:ext uri="{28A0092B-C50C-407E-A947-70E740481C1C}">
                           <a14:useLocalDpi xmlns:a14="http://schemas.microsoft.com/office/drawing/2010/main" val="0"/>
@@ -1811,7 +1688,7 @@
                     <pic:cNvPicPr/>
                   </pic:nvPicPr>
                   <pic:blipFill>
-                    <a:blip r:embed="rId7"/>
+                    <a:blip r:embed="rId8"/>
                     <a:stretch>
                       <a:fillRect/>
                     </a:stretch>
@@ -1862,7 +1739,7 @@
                     <pic:cNvPicPr/>
                   </pic:nvPicPr>
                   <pic:blipFill>
-                    <a:blip r:embed="rId8"/>
+                    <a:blip r:embed="rId9"/>
                     <a:stretch>
                       <a:fillRect/>
                     </a:stretch>
@@ -2297,7 +2174,7 @@
                     </pic:cNvPicPr>
                   </pic:nvPicPr>
                   <pic:blipFill>
-                    <a:blip r:embed="rId9">
+                    <a:blip r:embed="rId10">
                       <a:extLst>
                         <a:ext uri="{28A0092B-C50C-407E-A947-70E740481C1C}">
                           <a14:useLocalDpi xmlns:a14="http://schemas.microsoft.com/office/drawing/2010/main" val="0"/>
@@ -2356,7 +2233,7 @@
                     </pic:cNvPicPr>
                   </pic:nvPicPr>
                   <pic:blipFill>
-                    <a:blip r:embed="rId10" cstate="print">
+                    <a:blip r:embed="rId11" cstate="print">
                       <a:extLst>
                         <a:ext uri="{28A0092B-C50C-407E-A947-70E740481C1C}">
                           <a14:useLocalDpi xmlns:a14="http://schemas.microsoft.com/office/drawing/2010/main" val="0"/>
@@ -2470,7 +2347,7 @@
                     </pic:cNvPicPr>
                   </pic:nvPicPr>
                   <pic:blipFill>
-                    <a:blip r:embed="rId11" cstate="print">
+                    <a:blip r:embed="rId12" cstate="print">
                       <a:extLst>
                         <a:ext uri="{28A0092B-C50C-407E-A947-70E740481C1C}">
                           <a14:useLocalDpi xmlns:a14="http://schemas.microsoft.com/office/drawing/2010/main" val="0"/>
@@ -2579,7 +2456,7 @@
         </w:rPr>
         <w:br/>
       </w:r>
-      <w:hyperlink r:id="rId12" w:tgtFrame="_new" w:history="1">
+      <w:hyperlink r:id="rId13" w:tgtFrame="_new" w:history="1">
         <w:r>
           <w:rPr>
             <w:rStyle w:val="Hyperlink"/>
@@ -2623,7 +2500,7 @@
         </w:rPr>
         <w:br/>
       </w:r>
-      <w:hyperlink r:id="rId13" w:tgtFrame="_new" w:history="1">
+      <w:hyperlink r:id="rId14" w:tgtFrame="_new" w:history="1">
         <w:r>
           <w:rPr>
             <w:rStyle w:val="Hyperlink"/>
@@ -4376,6 +4253,7 @@
   <w:style w:type="character" w:default="1" w:styleId="DefaultParagraphFont">
     <w:name w:val="Default Paragraph Font"/>
     <w:uiPriority w:val="1"/>
+    <w:semiHidden/>
     <w:unhideWhenUsed/>
   </w:style>
   <w:style w:type="table" w:default="1" w:styleId="TableNormal">

</xml_diff>